<commit_message>
pushing start of unit 4
</commit_message>
<xml_diff>
--- a/Unit 3/Unit 3 Results.docx
+++ b/Unit 3/Unit 3 Results.docx
@@ -5,9 +5,27 @@
     <w:p>
       <w:pPr>
         <w:pStyle w:val="NoSpacing"/>
+        <w:rPr>
+          <w:u w:val="single"/>
+        </w:rPr>
       </w:pPr>
       <w:r>
-        <w:t>Computer Modelling  - Unit 3</w:t>
+        <w:rPr>
+          <w:u w:val="single"/>
+        </w:rPr>
+        <w:t xml:space="preserve">Computer </w:t>
+      </w:r>
+      <w:r>
+        <w:rPr>
+          <w:u w:val="single"/>
+        </w:rPr>
+        <w:t>Modelling -</w:t>
+      </w:r>
+      <w:r>
+        <w:rPr>
+          <w:u w:val="single"/>
+        </w:rPr>
+        <w:t xml:space="preserve"> Unit 3</w:t>
       </w:r>
     </w:p>
     <w:p/>
@@ -28,7 +46,16 @@
     </w:p>
     <w:p>
       <w:r>
-        <w:t>Distance using rectangle:</w:t>
+        <w:t>Distance using rectangle</w:t>
+      </w:r>
+      <w:r>
+        <w:t xml:space="preserve"> at 10000</w:t>
+      </w:r>
+      <w:r>
+        <w:t xml:space="preserve"> steps</w:t>
+      </w:r>
+      <w:r>
+        <w:t>:</w:t>
       </w:r>
       <w:r>
         <w:t xml:space="preserve"> </w:t>
@@ -39,7 +66,16 @@
     </w:p>
     <w:p>
       <w:r>
-        <w:t xml:space="preserve">Distance using trapezoid: </w:t>
+        <w:t>Distance using trapezoid</w:t>
+      </w:r>
+      <w:r>
+        <w:t xml:space="preserve"> </w:t>
+      </w:r>
+      <w:r>
+        <w:t>at 10000 steps</w:t>
+      </w:r>
+      <w:r>
+        <w:t xml:space="preserve">: </w:t>
       </w:r>
       <w:r>
         <w:t>3212.0557839189014</w:t>
@@ -47,48 +83,254 @@
     </w:p>
     <w:p>
       <w:r>
-        <w:t xml:space="preserve">Distance using Simpson’s: </w:t>
+        <w:t>Distance using Simpson’s</w:t>
+      </w:r>
+      <w:r>
+        <w:t xml:space="preserve"> </w:t>
+      </w:r>
+      <w:r>
+        <w:t>at 10000 steps</w:t>
+      </w:r>
+      <w:r>
+        <w:t xml:space="preserve">: </w:t>
       </w:r>
       <w:r>
         <w:t>3212.055783501712</w:t>
       </w:r>
     </w:p>
     <w:p/>
-    <w:p>
-      <w:r>
-        <w:t xml:space="preserve">Simpson’s method remains accurate to 6 decimal places when the </w:t>
-      </w:r>
-      <w:r>
-        <w:t>number of steps is decreased from 10000 to 100.</w:t>
-      </w:r>
-    </w:p>
-    <w:p>
-      <w:r>
-        <w:t xml:space="preserve">The trapezoid method remains accurate to </w:t>
-      </w:r>
-      <w:r>
-        <w:t>2 decimal places when the number of steps is decreased from 10000 to 100.</w:t>
-      </w:r>
-    </w:p>
-    <w:p>
-      <w:r>
-        <w:t xml:space="preserve">The rectangle method </w:t>
-      </w:r>
-      <w:r>
-        <w:t>remains accurate to 2 significant figures</w:t>
-      </w:r>
-      <w:r>
-        <w:t xml:space="preserve"> when the number of steps is decreased from 10000 to 100.</w:t>
-      </w:r>
-    </w:p>
-    <w:p>
-      <w:r>
-        <w:t xml:space="preserve">Simpson’s method is consistently the most accurate when varying </w:t>
-      </w:r>
-      <w:r>
-        <w:t>the number of steps, with very little variation. The rectangle method is the least accurate, with the value changing a significant amount with the number of steps.</w:t>
-      </w:r>
-    </w:p>
+    <w:tbl>
+      <w:tblPr>
+        <w:tblStyle w:val="TableGrid"/>
+        <w:tblW w:w="0" w:type="auto"/>
+        <w:tblLook w:val="04A0" w:firstRow="1" w:lastRow="0" w:firstColumn="1" w:lastColumn="0" w:noHBand="0" w:noVBand="1"/>
+      </w:tblPr>
+      <w:tblGrid>
+        <w:gridCol w:w="2185"/>
+        <w:gridCol w:w="2277"/>
+        <w:gridCol w:w="2277"/>
+        <w:gridCol w:w="2277"/>
+      </w:tblGrid>
+      <w:tr>
+        <w:tc>
+          <w:tcPr>
+            <w:tcW w:w="2254" w:type="dxa"/>
+          </w:tcPr>
+          <w:p>
+            <w:pPr>
+              <w:jc w:val="center"/>
+            </w:pPr>
+            <w:r>
+              <w:t xml:space="preserve">Number of </w:t>
+            </w:r>
+            <w:r>
+              <w:t>steps</w:t>
+            </w:r>
+          </w:p>
+        </w:tc>
+        <w:tc>
+          <w:tcPr>
+            <w:tcW w:w="2254" w:type="dxa"/>
+          </w:tcPr>
+          <w:p>
+            <w:r>
+              <w:t>Rectangle Rule</w:t>
+            </w:r>
+          </w:p>
+        </w:tc>
+        <w:tc>
+          <w:tcPr>
+            <w:tcW w:w="2254" w:type="dxa"/>
+          </w:tcPr>
+          <w:p>
+            <w:r>
+              <w:t>Tr</w:t>
+            </w:r>
+            <w:r>
+              <w:t>apezoid Rule</w:t>
+            </w:r>
+          </w:p>
+        </w:tc>
+        <w:tc>
+          <w:tcPr>
+            <w:tcW w:w="2254" w:type="dxa"/>
+          </w:tcPr>
+          <w:p>
+            <w:r>
+              <w:t>Simpson Rule</w:t>
+            </w:r>
+          </w:p>
+        </w:tc>
+      </w:tr>
+      <w:tr>
+        <w:tc>
+          <w:tcPr>
+            <w:tcW w:w="2254" w:type="dxa"/>
+          </w:tcPr>
+          <w:p>
+            <w:r>
+              <w:t>100</w:t>
+            </w:r>
+          </w:p>
+        </w:tc>
+        <w:tc>
+          <w:tcPr>
+            <w:tcW w:w="2254" w:type="dxa"/>
+          </w:tcPr>
+          <w:p>
+            <w:r>
+              <w:t>3221.0545231663673</w:t>
+            </w:r>
+          </w:p>
+        </w:tc>
+        <w:tc>
+          <w:tcPr>
+            <w:tcW w:w="2254" w:type="dxa"/>
+          </w:tcPr>
+          <w:p>
+            <w:r>
+              <w:t>3212.0600395537654</w:t>
+            </w:r>
+          </w:p>
+        </w:tc>
+        <w:tc>
+          <w:tcPr>
+            <w:tcW w:w="2254" w:type="dxa"/>
+          </w:tcPr>
+          <w:p>
+            <w:r>
+              <w:t>3212.0557834801994</w:t>
+            </w:r>
+          </w:p>
+        </w:tc>
+      </w:tr>
+      <w:tr>
+        <w:tc>
+          <w:tcPr>
+            <w:tcW w:w="2254" w:type="dxa"/>
+          </w:tcPr>
+          <w:p>
+            <w:r>
+              <w:t>1000</w:t>
+            </w:r>
+          </w:p>
+        </w:tc>
+        <w:tc>
+          <w:tcPr>
+            <w:tcW w:w="2254" w:type="dxa"/>
+          </w:tcPr>
+          <w:p>
+            <w:r>
+              <w:t>3212.9552820453805</w:t>
+            </w:r>
+          </w:p>
+        </w:tc>
+        <w:tc>
+          <w:tcPr>
+            <w:tcW w:w="2254" w:type="dxa"/>
+          </w:tcPr>
+          <w:p>
+            <w:r>
+              <w:t>3212.055825297954</w:t>
+            </w:r>
+          </w:p>
+        </w:tc>
+        <w:tc>
+          <w:tcPr>
+            <w:tcW w:w="2254" w:type="dxa"/>
+          </w:tcPr>
+          <w:p>
+            <w:r>
+              <w:t>3212.055783501698</w:t>
+            </w:r>
+          </w:p>
+        </w:tc>
+      </w:tr>
+      <w:tr>
+        <w:tc>
+          <w:tcPr>
+            <w:tcW w:w="2254" w:type="dxa"/>
+          </w:tcPr>
+          <w:p>
+            <w:r>
+              <w:t>10000</w:t>
+            </w:r>
+          </w:p>
+        </w:tc>
+        <w:tc>
+          <w:tcPr>
+            <w:tcW w:w="2254" w:type="dxa"/>
+          </w:tcPr>
+          <w:p>
+            <w:r>
+              <w:t>3212.1457296019194</w:t>
+            </w:r>
+          </w:p>
+        </w:tc>
+        <w:tc>
+          <w:tcPr>
+            <w:tcW w:w="2254" w:type="dxa"/>
+          </w:tcPr>
+          <w:p>
+            <w:r>
+              <w:t>3212.0557839189014</w:t>
+            </w:r>
+          </w:p>
+        </w:tc>
+        <w:tc>
+          <w:tcPr>
+            <w:tcW w:w="2254" w:type="dxa"/>
+          </w:tcPr>
+          <w:p>
+            <w:r>
+              <w:t>3212.055783501712</w:t>
+            </w:r>
+          </w:p>
+        </w:tc>
+      </w:tr>
+      <w:tr>
+        <w:tc>
+          <w:tcPr>
+            <w:tcW w:w="2254" w:type="dxa"/>
+          </w:tcPr>
+          <w:p>
+            <w:r>
+              <w:t>100000</w:t>
+            </w:r>
+          </w:p>
+        </w:tc>
+        <w:tc>
+          <w:tcPr>
+            <w:tcW w:w="2254" w:type="dxa"/>
+          </w:tcPr>
+          <w:p>
+            <w:r>
+              <w:t>3212.064778074204</w:t>
+            </w:r>
+          </w:p>
+        </w:tc>
+        <w:tc>
+          <w:tcPr>
+            <w:tcW w:w="2254" w:type="dxa"/>
+          </w:tcPr>
+          <w:p>
+            <w:r>
+              <w:t>3212.055783505873</w:t>
+            </w:r>
+          </w:p>
+        </w:tc>
+        <w:tc>
+          <w:tcPr>
+            <w:tcW w:w="2254" w:type="dxa"/>
+          </w:tcPr>
+          <w:p>
+            <w:r>
+              <w:t>3212.055783501665</w:t>
+            </w:r>
+          </w:p>
+        </w:tc>
+      </w:tr>
+    </w:tbl>
     <w:p/>
     <w:p>
       <w:r>
@@ -113,10 +355,18 @@
         <w:t xml:space="preserve"> </w:t>
       </w:r>
       <w:r>
-        <w:t xml:space="preserve">at a distance of </w:t>
-      </w:r>
-      <w:r>
-        <w:t xml:space="preserve">about 0.8Mpc </w:t>
+        <w:t xml:space="preserve">at </w:t>
+      </w:r>
+      <w:proofErr w:type="gramStart"/>
+      <w:r>
+        <w:t xml:space="preserve">a distance of </w:t>
+      </w:r>
+      <w:r>
+        <w:t>about</w:t>
+      </w:r>
+      <w:proofErr w:type="gramEnd"/>
+      <w:r>
+        <w:t xml:space="preserve"> 0.8Mpc </w:t>
       </w:r>
       <w:r>
         <w:t xml:space="preserve">[Distance to the </w:t>
@@ -128,10 +378,26 @@
         <w:t>ndromeda galaxy from eclipsing binaries</w:t>
       </w:r>
       <w:r>
-        <w:t>, F. Vilardell et al, Astronomy</w:t>
-      </w:r>
-      <w:r>
-        <w:t>&amp;Astrophysics, 21/01/10]</w:t>
+        <w:t xml:space="preserve">, F. </w:t>
+      </w:r>
+      <w:proofErr w:type="spellStart"/>
+      <w:r>
+        <w:t>Vilardell</w:t>
+      </w:r>
+      <w:proofErr w:type="spellEnd"/>
+      <w:r>
+        <w:t xml:space="preserve"> et al, </w:t>
+      </w:r>
+      <w:proofErr w:type="spellStart"/>
+      <w:r>
+        <w:t>Astronomy</w:t>
+      </w:r>
+      <w:r>
+        <w:t>&amp;Astrophysics</w:t>
+      </w:r>
+      <w:proofErr w:type="spellEnd"/>
+      <w:r>
+        <w:t>, 21/01/10]</w:t>
       </w:r>
       <w:r>
         <w:t xml:space="preserve">. </w:t>
@@ -155,7 +421,23 @@
         <w:t xml:space="preserve"> 1% uncertainty [The Hubble Tension</w:t>
       </w:r>
       <w:r>
-        <w:t xml:space="preserve">, V.Poulin, CernCourier, </w:t>
+        <w:t xml:space="preserve">, </w:t>
+      </w:r>
+      <w:proofErr w:type="spellStart"/>
+      <w:r>
+        <w:t>V.Poulin</w:t>
+      </w:r>
+      <w:proofErr w:type="spellEnd"/>
+      <w:r>
+        <w:t xml:space="preserve">, </w:t>
+      </w:r>
+      <w:proofErr w:type="spellStart"/>
+      <w:r>
+        <w:t>CernCourier</w:t>
+      </w:r>
+      <w:proofErr w:type="spellEnd"/>
+      <w:r>
+        <w:t xml:space="preserve">, </w:t>
       </w:r>
       <w:hyperlink r:id="rId5" w:history="1">
         <w:r>
@@ -196,29 +478,19 @@
         <w:t>10^-3.</w:t>
       </w:r>
     </w:p>
-    <w:p/>
     <w:p>
-      <w:r>
-        <w:t xml:space="preserve">Recommended method: </w:t>
-      </w:r>
-      <w:r>
-        <w:t xml:space="preserve">Using Simpson with </w:t>
-      </w:r>
-      <w:r>
-        <w:t>10^3 steps will give the lowest error for least evaluations.</w:t>
-      </w:r>
-    </w:p>
-    <w:p>
+      <w:pPr>
+        <w:jc w:val="center"/>
+      </w:pPr>
       <w:r>
         <w:rPr>
           <w:noProof/>
         </w:rPr>
-        <w:lastRenderedPageBreak/>
         <w:drawing>
-          <wp:inline distT="0" distB="0" distL="0" distR="0" wp14:anchorId="192E2D2D" wp14:editId="1611B7D1">
-            <wp:extent cx="3667125" cy="2741609"/>
-            <wp:effectExtent l="0" t="0" r="0" b="1905"/>
-            <wp:docPr id="795767487" name="Picture 1" descr="A graph of different colored lines&#10;&#10;AI-generated content may be incorrect."/>
+          <wp:inline distT="0" distB="0" distL="0" distR="0" wp14:anchorId="3C79C41C" wp14:editId="23AE2BDA">
+            <wp:extent cx="5731510" cy="3620135"/>
+            <wp:effectExtent l="0" t="0" r="2540" b="0"/>
+            <wp:docPr id="1077125761" name="Picture 7" descr="A graph of a number of evaluations&#10;&#10;AI-generated content may be incorrect."/>
             <wp:cNvGraphicFramePr>
               <a:graphicFrameLocks xmlns:a="http://schemas.openxmlformats.org/drawingml/2006/main" noChangeAspect="1"/>
             </wp:cNvGraphicFramePr>
@@ -226,11 +498,17 @@
               <a:graphicData uri="http://schemas.openxmlformats.org/drawingml/2006/picture">
                 <pic:pic xmlns:pic="http://schemas.openxmlformats.org/drawingml/2006/picture">
                   <pic:nvPicPr>
-                    <pic:cNvPr id="795767487" name="Picture 1" descr="A graph of different colored lines&#10;&#10;AI-generated content may be incorrect."/>
+                    <pic:cNvPr id="1077125761" name="Picture 7" descr="A graph of a number of evaluations&#10;&#10;AI-generated content may be incorrect."/>
                     <pic:cNvPicPr/>
                   </pic:nvPicPr>
                   <pic:blipFill>
-                    <a:blip r:embed="rId6"/>
+                    <a:blip r:embed="rId6">
+                      <a:extLst>
+                        <a:ext uri="{28A0092B-C50C-407E-A947-70E740481C1C}">
+                          <a14:useLocalDpi xmlns:a14="http://schemas.microsoft.com/office/drawing/2010/main" val="0"/>
+                        </a:ext>
+                      </a:extLst>
+                    </a:blip>
                     <a:stretch>
                       <a:fillRect/>
                     </a:stretch>
@@ -238,7 +516,7 @@
                   <pic:spPr>
                     <a:xfrm>
                       <a:off x="0" y="0"/>
-                      <a:ext cx="3671857" cy="2745146"/>
+                      <a:ext cx="5731510" cy="3620135"/>
                     </a:xfrm>
                     <a:prstGeom prst="rect">
                       <a:avLst/>
@@ -251,6 +529,19 @@
         </w:drawing>
       </w:r>
     </w:p>
+    <w:p>
+      <w:r>
+        <w:lastRenderedPageBreak/>
+        <w:t>Recommended method: Using Simpson with 10^3 steps will give the lowest error for least evaluations</w:t>
+      </w:r>
+      <w:r>
+        <w:t xml:space="preserve">, resulting in the most efficient calculation for the </w:t>
+      </w:r>
+      <w:r>
+        <w:t>most accurate value.</w:t>
+      </w:r>
+    </w:p>
+    <w:p/>
     <w:p/>
     <w:p>
       <w:r>
@@ -262,15 +553,18 @@
       </w:r>
     </w:p>
     <w:p>
+      <w:pPr>
+        <w:jc w:val="center"/>
+      </w:pPr>
       <w:r>
         <w:rPr>
           <w:noProof/>
         </w:rPr>
         <w:drawing>
-          <wp:inline distT="0" distB="0" distL="0" distR="0" wp14:anchorId="50FBA7A9" wp14:editId="388D0576">
-            <wp:extent cx="4652963" cy="3387910"/>
-            <wp:effectExtent l="0" t="0" r="0" b="3175"/>
-            <wp:docPr id="1559183532" name="Picture 1" descr="A blue line graph with white background&#10;&#10;AI-generated content may be incorrect."/>
+          <wp:inline distT="0" distB="0" distL="0" distR="0" wp14:anchorId="491F5C01" wp14:editId="29F7A6BF">
+            <wp:extent cx="4403751" cy="3303058"/>
+            <wp:effectExtent l="0" t="0" r="0" b="0"/>
+            <wp:docPr id="469719694" name="Picture 6" descr="A graph with a blue line&#10;&#10;AI-generated content may be incorrect."/>
             <wp:cNvGraphicFramePr>
               <a:graphicFrameLocks xmlns:a="http://schemas.openxmlformats.org/drawingml/2006/main" noChangeAspect="1"/>
             </wp:cNvGraphicFramePr>
@@ -278,11 +572,17 @@
               <a:graphicData uri="http://schemas.openxmlformats.org/drawingml/2006/picture">
                 <pic:pic xmlns:pic="http://schemas.openxmlformats.org/drawingml/2006/picture">
                   <pic:nvPicPr>
-                    <pic:cNvPr id="1559183532" name="Picture 1" descr="A blue line graph with white background&#10;&#10;AI-generated content may be incorrect."/>
+                    <pic:cNvPr id="469719694" name="Picture 6" descr="A graph with a blue line&#10;&#10;AI-generated content may be incorrect."/>
                     <pic:cNvPicPr/>
                   </pic:nvPicPr>
                   <pic:blipFill>
-                    <a:blip r:embed="rId7"/>
+                    <a:blip r:embed="rId7">
+                      <a:extLst>
+                        <a:ext uri="{28A0092B-C50C-407E-A947-70E740481C1C}">
+                          <a14:useLocalDpi xmlns:a14="http://schemas.microsoft.com/office/drawing/2010/main" val="0"/>
+                        </a:ext>
+                      </a:extLst>
+                    </a:blip>
                     <a:stretch>
                       <a:fillRect/>
                     </a:stretch>
@@ -290,7 +590,167 @@
                   <pic:spPr>
                     <a:xfrm>
                       <a:off x="0" y="0"/>
-                      <a:ext cx="4663881" cy="3395859"/>
+                      <a:ext cx="4417430" cy="3313318"/>
+                    </a:xfrm>
+                    <a:prstGeom prst="rect">
+                      <a:avLst/>
+                    </a:prstGeom>
+                  </pic:spPr>
+                </pic:pic>
+              </a:graphicData>
+            </a:graphic>
+          </wp:inline>
+        </w:drawing>
+      </w:r>
+    </w:p>
+    <w:p/>
+    <w:p>
+      <w:r>
+        <w:rPr>
+          <w:b/>
+          <w:bCs/>
+        </w:rPr>
+        <w:t>Task 4.4</w:t>
+      </w:r>
+    </w:p>
+    <w:p>
+      <w:pPr>
+        <w:jc w:val="center"/>
+      </w:pPr>
+      <w:r>
+        <w:rPr>
+          <w:noProof/>
+        </w:rPr>
+        <w:lastRenderedPageBreak/>
+        <w:drawing>
+          <wp:inline distT="0" distB="0" distL="0" distR="0" wp14:anchorId="2DBEA5CD" wp14:editId="2E3146BE">
+            <wp:extent cx="4743450" cy="3557851"/>
+            <wp:effectExtent l="0" t="0" r="0" b="5080"/>
+            <wp:docPr id="1342674176" name="Picture 1" descr="A graph of a number of red and blue lines&#10;&#10;AI-generated content may be incorrect."/>
+            <wp:cNvGraphicFramePr>
+              <a:graphicFrameLocks xmlns:a="http://schemas.openxmlformats.org/drawingml/2006/main" noChangeAspect="1"/>
+            </wp:cNvGraphicFramePr>
+            <a:graphic xmlns:a="http://schemas.openxmlformats.org/drawingml/2006/main">
+              <a:graphicData uri="http://schemas.openxmlformats.org/drawingml/2006/picture">
+                <pic:pic xmlns:pic="http://schemas.openxmlformats.org/drawingml/2006/picture">
+                  <pic:nvPicPr>
+                    <pic:cNvPr id="1342674176" name="Picture 1" descr="A graph of a number of red and blue lines&#10;&#10;AI-generated content may be incorrect."/>
+                    <pic:cNvPicPr/>
+                  </pic:nvPicPr>
+                  <pic:blipFill>
+                    <a:blip r:embed="rId8">
+                      <a:extLst>
+                        <a:ext uri="{28A0092B-C50C-407E-A947-70E740481C1C}">
+                          <a14:useLocalDpi xmlns:a14="http://schemas.microsoft.com/office/drawing/2010/main" val="0"/>
+                        </a:ext>
+                      </a:extLst>
+                    </a:blip>
+                    <a:stretch>
+                      <a:fillRect/>
+                    </a:stretch>
+                  </pic:blipFill>
+                  <pic:spPr>
+                    <a:xfrm>
+                      <a:off x="0" y="0"/>
+                      <a:ext cx="4767687" cy="3576030"/>
+                    </a:xfrm>
+                    <a:prstGeom prst="rect">
+                      <a:avLst/>
+                    </a:prstGeom>
+                  </pic:spPr>
+                </pic:pic>
+              </a:graphicData>
+            </a:graphic>
+          </wp:inline>
+        </w:drawing>
+      </w:r>
+      <w:r>
+        <w:rPr>
+          <w:noProof/>
+        </w:rPr>
+        <w:drawing>
+          <wp:inline distT="0" distB="0" distL="0" distR="0" wp14:anchorId="07143813" wp14:editId="42C74C11">
+            <wp:extent cx="4686300" cy="3514985"/>
+            <wp:effectExtent l="0" t="0" r="0" b="9525"/>
+            <wp:docPr id="277871685" name="Picture 2" descr="A graph of a number of different colored lines&#10;&#10;AI-generated content may be incorrect."/>
+            <wp:cNvGraphicFramePr>
+              <a:graphicFrameLocks xmlns:a="http://schemas.openxmlformats.org/drawingml/2006/main" noChangeAspect="1"/>
+            </wp:cNvGraphicFramePr>
+            <a:graphic xmlns:a="http://schemas.openxmlformats.org/drawingml/2006/main">
+              <a:graphicData uri="http://schemas.openxmlformats.org/drawingml/2006/picture">
+                <pic:pic xmlns:pic="http://schemas.openxmlformats.org/drawingml/2006/picture">
+                  <pic:nvPicPr>
+                    <pic:cNvPr id="277871685" name="Picture 2" descr="A graph of a number of different colored lines&#10;&#10;AI-generated content may be incorrect."/>
+                    <pic:cNvPicPr/>
+                  </pic:nvPicPr>
+                  <pic:blipFill>
+                    <a:blip r:embed="rId9">
+                      <a:extLst>
+                        <a:ext uri="{28A0092B-C50C-407E-A947-70E740481C1C}">
+                          <a14:useLocalDpi xmlns:a14="http://schemas.microsoft.com/office/drawing/2010/main" val="0"/>
+                        </a:ext>
+                      </a:extLst>
+                    </a:blip>
+                    <a:stretch>
+                      <a:fillRect/>
+                    </a:stretch>
+                  </pic:blipFill>
+                  <pic:spPr>
+                    <a:xfrm>
+                      <a:off x="0" y="0"/>
+                      <a:ext cx="4694584" cy="3521198"/>
+                    </a:xfrm>
+                    <a:prstGeom prst="rect">
+                      <a:avLst/>
+                    </a:prstGeom>
+                  </pic:spPr>
+                </pic:pic>
+              </a:graphicData>
+            </a:graphic>
+          </wp:inline>
+        </w:drawing>
+      </w:r>
+    </w:p>
+    <w:p>
+      <w:pPr>
+        <w:jc w:val="center"/>
+      </w:pPr>
+      <w:r>
+        <w:rPr>
+          <w:noProof/>
+        </w:rPr>
+        <w:lastRenderedPageBreak/>
+        <w:drawing>
+          <wp:inline distT="0" distB="0" distL="0" distR="0" wp14:anchorId="46A35169" wp14:editId="4EA57B86">
+            <wp:extent cx="4933950" cy="3700736"/>
+            <wp:effectExtent l="0" t="0" r="0" b="0"/>
+            <wp:docPr id="1074147514" name="Picture 4" descr="A graph of a number of red and green lines&#10;&#10;AI-generated content may be incorrect."/>
+            <wp:cNvGraphicFramePr>
+              <a:graphicFrameLocks xmlns:a="http://schemas.openxmlformats.org/drawingml/2006/main" noChangeAspect="1"/>
+            </wp:cNvGraphicFramePr>
+            <a:graphic xmlns:a="http://schemas.openxmlformats.org/drawingml/2006/main">
+              <a:graphicData uri="http://schemas.openxmlformats.org/drawingml/2006/picture">
+                <pic:pic xmlns:pic="http://schemas.openxmlformats.org/drawingml/2006/picture">
+                  <pic:nvPicPr>
+                    <pic:cNvPr id="1074147514" name="Picture 4" descr="A graph of a number of red and green lines&#10;&#10;AI-generated content may be incorrect."/>
+                    <pic:cNvPicPr/>
+                  </pic:nvPicPr>
+                  <pic:blipFill>
+                    <a:blip r:embed="rId10">
+                      <a:extLst>
+                        <a:ext uri="{28A0092B-C50C-407E-A947-70E740481C1C}">
+                          <a14:useLocalDpi xmlns:a14="http://schemas.microsoft.com/office/drawing/2010/main" val="0"/>
+                        </a:ext>
+                      </a:extLst>
+                    </a:blip>
+                    <a:stretch>
+                      <a:fillRect/>
+                    </a:stretch>
+                  </pic:blipFill>
+                  <pic:spPr>
+                    <a:xfrm>
+                      <a:off x="0" y="0"/>
+                      <a:ext cx="4940897" cy="3705947"/>
                     </a:xfrm>
                     <a:prstGeom prst="rect">
                       <a:avLst/>
@@ -1262,6 +1722,25 @@
       <w:shd w:val="clear" w:color="auto" w:fill="E1DFDD"/>
     </w:rPr>
   </w:style>
+  <w:style w:type="table" w:styleId="TableGrid">
+    <w:name w:val="Table Grid"/>
+    <w:basedOn w:val="TableNormal"/>
+    <w:uiPriority w:val="39"/>
+    <w:rsid w:val="00711FC2"/>
+    <w:pPr>
+      <w:spacing w:after="0" w:line="240" w:lineRule="auto"/>
+    </w:pPr>
+    <w:tblPr>
+      <w:tblBorders>
+        <w:top w:val="single" w:sz="4" w:space="0" w:color="auto"/>
+        <w:left w:val="single" w:sz="4" w:space="0" w:color="auto"/>
+        <w:bottom w:val="single" w:sz="4" w:space="0" w:color="auto"/>
+        <w:right w:val="single" w:sz="4" w:space="0" w:color="auto"/>
+        <w:insideH w:val="single" w:sz="4" w:space="0" w:color="auto"/>
+        <w:insideV w:val="single" w:sz="4" w:space="0" w:color="auto"/>
+      </w:tblBorders>
+    </w:tblPr>
+  </w:style>
 </w:styles>
 </file>
 

</xml_diff>